<commit_message>
Clarify Book 2 epilogue chronology
</commit_message>
<xml_diff>
--- a/The Relativistic Investigation Bureau - SERIES/Book 2 - The Warning That Was Sent Too Late/The_Warning_That_Was_Sent_Too_Late_BOOK_2_REV05_LINE_EDIT_DRAFT.docx
+++ b/The Relativistic Investigation Bureau - SERIES/Book 2 - The Warning That Was Sent Too Late/The_Warning_That_Was_Sent_Too_Late_BOOK_2_REV05_LINE_EDIT_DRAFT.docx
@@ -711,109 +711,7 @@
         <w:spacing w:after="160" w:line="240" w:lineRule="auto"/>
       </w:pPr>
       <w:r>
-        <w:rPr>
-          <w:rFonts w:ascii="Georgia" w:eastAsia="Georgia" w:hAnsi="Georgia"/>
-        </w:rPr>
-        <w:t>This is the second case of the Relativistic Investigation Bureau, and it stands on its own. You need no physics, and you do not need Book One, to follow it. The comedy is the bait. The geometry is the trap.</w:t>
-      </w:r>
-    </w:p>
-    <w:p>
-      <w:pPr>
-        <w:spacing w:after="160" w:line="240" w:lineRule="auto"/>
-      </w:pPr>
-      <w:r>
-        <w:rPr>
-          <w:rFonts w:ascii="Georgia" w:eastAsia="Georgia" w:hAnsi="Georgia"/>
-        </w:rPr>
-        <w:t>The novel is the case of the morning sheet: a warning on the Bureau’s own form, dated tomorrow, from a sender whose date of birth is NOT YET; an office door that is already open onto a railway platform; and a voice, Derek Gent’s own, that arrives too late to stop it. The Bureau has from Monday morning to Wednesday to put three things in the right order and to decide who, if anybody, wrote the first one.</w:t>
-      </w:r>
-    </w:p>
-    <w:p>
-      <w:pPr>
-        <w:spacing w:after="160" w:line="240" w:lineRule="auto"/>
-      </w:pPr>
-      <w:r>
-        <w:rPr>
-          <w:rFonts w:ascii="Georgia" w:eastAsia="Georgia" w:hAnsi="Georgia"/>
-        </w:rPr>
-        <w:t>The course, Tense for Investigators, follows the novel in six lessons. Most chapters, and the Epilogue, end with a Rule and a link to the lesson they use. Read a lesson when you want the physics behind the investigation; leave it until later when you want to know what happens next.</w:t>
-      </w:r>
-    </w:p>
-    <w:p>
-      <w:pPr>
-        <w:spacing w:after="160" w:line="240" w:lineRule="auto"/>
-      </w:pPr>
-      <w:r>
-        <w:rPr>
-          <w:rFonts w:ascii="Georgia" w:eastAsia="Georgia" w:hAnsi="Georgia"/>
-        </w:rPr>
-        <w:t>A note on Lesson 6. Lessons 1 to 5 each teach one idea, and the Prologue and Chapters 1 to 9 work through them in order. From Chapter 10 to the Epilogue every link points to Lesson 6. That is deliberate. Lesson 6 is the capstone: it adds no new idea, it puts the first five to work and closes a case of this kind in one paragraph. Read the second half of the book as its worked example, and go back to Lesson 6 as often as the chapters send you. You will understand it better each time.</w:t>
-      </w:r>
-    </w:p>
-    <w:p>
-      <w:pPr>
-        <w:spacing w:after="160" w:line="240" w:lineRule="auto"/>
-      </w:pPr>
-      <w:r>
-        <w:rPr>
-          <w:rFonts w:ascii="Georgia" w:eastAsia="Georgia" w:hAnsi="Georgia"/>
-        </w:rPr>
-        <w:t>Three honest ways to read this book.</w:t>
-      </w:r>
-    </w:p>
-    <w:p>
-      <w:pPr>
-        <w:spacing w:after="160" w:line="240" w:lineRule="auto"/>
-      </w:pPr>
-      <w:r>
-        <w:rPr>
-          <w:rFonts w:ascii="Georgia" w:eastAsia="Georgia" w:hAnsi="Georgia"/>
-        </w:rPr>
-        <w:t>For the story alone: read the chapters and stop at each Rule. The case explains its own solution.</w:t>
-      </w:r>
-    </w:p>
-    <w:p>
-      <w:pPr>
-        <w:spacing w:after="160" w:line="240" w:lineRule="auto"/>
-      </w:pPr>
-      <w:r>
-        <w:rPr>
-          <w:rFonts w:ascii="Georgia" w:eastAsia="Georgia" w:hAnsi="Georgia"/>
-        </w:rPr>
-        <w:t>To take the class: read each chapter, then the lesson it points to. No physics is assumed at the start, and none of Book One’s algebra is repeated.</w:t>
-      </w:r>
-    </w:p>
-    <w:p>
-      <w:pPr>
-        <w:spacing w:after="160" w:line="240" w:lineRule="auto"/>
-      </w:pPr>
-      <w:r>
-        <w:rPr>
-          <w:rFonts w:ascii="Georgia" w:eastAsia="Georgia" w:hAnsi="Georgia"/>
-        </w:rPr>
-        <w:t>If you are impatient: the sheet arrives in the Prologue and the door opens at the end of it. The Bureau understands impatience; it simply prefers it in writing.</w:t>
-      </w:r>
-    </w:p>
-    <w:p>
-      <w:pPr>
-        <w:spacing w:after="160" w:line="240" w:lineRule="auto"/>
-      </w:pPr>
-      <w:r>
-        <w:rPr>
-          <w:rFonts w:ascii="Georgia" w:eastAsia="Georgia" w:hAnsi="Georgia"/>
-        </w:rPr>
-        <w:t>One promise: relativity will not be used as permission for a message to arrive from its own future. The investigation accounts for the morning sheet's words, route and arrival. The platform itself remains unexplained; the Sunday slip and the voice remain open questions.</w:t>
-      </w:r>
-    </w:p>
-    <w:p>
-      <w:pPr>
-        <w:spacing w:after="160" w:line="240" w:lineRule="auto"/>
-      </w:pPr>
-      <w:r>
-        <w:rPr>
-          <w:rFonts w:ascii="Georgia" w:eastAsia="Georgia" w:hAnsi="Georgia"/>
-        </w:rPr>
-        <w:t>A companion film for each lesson is listed at the end of the course. None of them is required.</w:t>
+        <w:t>Welcome to the Bureau. This case stands alone, and no physics background is needed: read on and skip the lesson links. The optional six-lesson course is here only if the story sparks your curiosity.</w:t>
       </w:r>
     </w:p>
     <w:p>
@@ -838,21 +736,15 @@
         <w:spacing w:after="160" w:line="240" w:lineRule="auto"/>
       </w:pPr>
       <w:r>
-        <w:rPr>
-          <w:rFonts w:ascii="Georgia" w:eastAsia="Georgia" w:hAnsi="Georgia"/>
-        </w:rPr>
-        <w:t>As in the first case, the science and historical details identified below are real; the case is fiction. The relativity used here is well tested in the situations described. Closed timelike curves occur in some mathematical solutions of General Relativity, but none have been observed; the self-consistency principle is a proposal, not an established physical law.</w:t>
-      </w:r>
-    </w:p>
-    <w:p>
-      <w:pPr>
-        <w:spacing w:after="160" w:line="240" w:lineRule="auto"/>
-      </w:pPr>
-      <w:r>
-        <w:rPr>
-          <w:rFonts w:ascii="Georgia" w:eastAsia="Georgia" w:hAnsi="Georgia"/>
-        </w:rPr>
-        <w:t>Real: the speed of light and what it does, and does not do, to the order of events; the slowing of moving clocks, including the 1971 Hafele–Keating flights, whose caesium clocks came home about 59 billionths of a second behind after flying east and about 273 billionths of a second ahead after flying west; the second, defined since 1967 by 9,192,631,770 periods of radiation corresponding to a transition between two hyperfine levels of caesium-133; the DCF77 time signal, broadcast from near Frankfurt for Germany’s national metrology institute, the PTB in Braunschweig; and Paddington station and its airport trains. The films named in the course are real films, and every book in the bibliography exists.</w:t>
+        <w:t>As in the first case, the science and historical details identified below are real; the case is fiction. The relativity used here is well tested in the situations described. Closed timelike curves occur in some mathematical solutions of General Relativity, but none have been observed; the self-consistency principle is a proposal, not an established physical law. The case accounts for the morning sheet’s words, route, and arrival; relativity does not send it from its own future. The platform, Sunday slip, and voice remain open questions.</w:t>
+      </w:r>
+    </w:p>
+    <w:p>
+      <w:pPr>
+        <w:spacing w:after="160" w:line="240" w:lineRule="auto"/>
+      </w:pPr>
+      <w:r>
+        <w:t>Real: the speed of light and what it does, and does not do, to the order of events; the slowing of moving clocks, including the 1971 Hafele–Keating flights, whose caesium clocks came home about 59 billionths of a second behind after flying east and about 273 billionths of a second ahead after flying west; the SI second, tied to the caesium-133 hyperfine transition since 1967 and now defined by fixing its unperturbed frequency at exactly 9,192,631,770 Hz; the DCF77 time signal, broadcast from near Frankfurt for Germany’s national metrology institute, the PTB in Braunschweig; and Paddington station and its airport trains. The films named in the course are real films, and every book in the bibliography exists.</w:t>
       </w:r>
     </w:p>
     <w:p>
@@ -874,13 +766,12 @@
         <w:rPr>
           <w:rFonts w:ascii="Georgia" w:eastAsia="Georgia" w:hAnsi="Georgia"/>
         </w:rPr>
-        <w:t>Weinstein’s night train is real. The Sud Expresso (the Sud Express, in French) ran overnight from the French–Spanish border at Hendaye and Irún, across Spain, to Lisbon, and entered Portugal at Vilar Formoso. It was suspended on 17 March 2020, at the start of the pandemic, and at the time of writing it has not run since. That is why Weinstein speaks of it in the past tense. The border clocks are real too: mainland Portugal moved to Central European Time, Spain’s time, in September 1992, and went back to Wes</w:t>
-      </w:r>
-      <w:r>
-        <w:rPr>
-          <w:rFonts w:ascii="Georgia" w:eastAsia="Georgia" w:hAnsi="Georgia"/>
-        </w:rPr>
-        <w:t>tern European Time in 1996. A government can move every clock in a country by an hour with a signature. It cannot make one of them tick slower.</w:t>
+        <w:t>Weinstein’s night train is real. The Sud Expresso (the Sud Express, in French) ran overnight from the French–Spanish border at Hendaye and Irún, across Spain, to Lisbon, and entered Portugal at Vilar Formoso. It was suspended on 17 March 2020 amid the pandemic and border closures. That is why Weinstein speaks of it in the past tense. The border clocks are real too: mainland Portugal moved to Central European Time, Spain’s time, in September 1992, and went back to Western European Time in 1996. A government can move every clock in a country by an hour with a signature. It cannot make one of them tick slower.</w:t>
+      </w:r>
+      <w:r>
+        <w:rPr>
+          <w:rFonts w:ascii="Georgia" w:eastAsia="Georgia" w:hAnsi="Georgia"/>
+        </w:rPr>
       </w:r>
     </w:p>
     <w:p>
@@ -8842,13 +8733,12 @@
         <w:rPr>
           <w:rFonts w:ascii="Georgia" w:eastAsia="Georgia" w:hAnsi="Georgia"/>
         </w:rPr>
-        <w:t xml:space="preserve">The hour between the calls and the end of school was the longest of the day, and none of them filled it with anything useful. Weinstein bought a newspaper he did not read and a coffee he described, after one sip, as an argument against the European project. Trevor, back from the pavement with an empty paper cup he would not throw away, sat with the slip and recopied the times onto a second envelope in case the first went missing. Penny rang Mrs Marsh twice and was told, twice, that the platform was still a </w:t>
-      </w:r>
-      <w:r>
-        <w:rPr>
-          <w:rFonts w:ascii="Georgia" w:eastAsia="Georgia" w:hAnsi="Georgia"/>
-        </w:rPr>
-        <w:t>platform, and on the second occasion that the landlord had now sent a second email, in capitals, which Mrs Marsh did not hold with. Derek could not sit. Every time a family went past with a child in a school jumper, he looked, and every time he made himself look away, and every time Penny watched him do it and said nothing at all. That was its own kind of commentary.</w:t>
+        <w:t>The hour between the calls and the end of school dragged; none of them found anything useful to do. Weinstein bought a newspaper he did not read and a coffee he described, after one sip, as an argument against the European project. Trevor came back from the pavement with an empty paper cup he would not throw away, then recopied the times onto a second envelope in case the first went missing. Penny rang Mrs Marsh twice. The platform remained a platform; the landlord had sent a second email, in capitals, which Mrs Marsh did not hold with. Derek could not sit. Each family passing with a child in a school jumper caught his eye. He made himself look away, and Penny watched without comment.</w:t>
+      </w:r>
+      <w:r>
+        <w:rPr>
+          <w:rFonts w:ascii="Georgia" w:eastAsia="Georgia" w:hAnsi="Georgia"/>
+        </w:rPr>
       </w:r>
     </w:p>
     <w:p>
@@ -21212,7 +21102,7 @@
         <w:rPr>
           <w:rFonts w:ascii="Georgia" w:eastAsia="Georgia" w:hAnsi="Georgia"/>
         </w:rPr>
-        <w:t>At half past six Gucci arrived with Tabitha.</w:t>
+        <w:t>At half past six on Tuesday Gucci arrived with Tabitha.</w:t>
       </w:r>
     </w:p>
     <w:p>
@@ -22577,16 +22467,7 @@
         <w:spacing w:after="160" w:line="240" w:lineRule="auto"/>
       </w:pPr>
       <w:r>
-        <w:rPr>
-          <w:rFonts w:ascii="Georgia" w:eastAsia="Georgia" w:hAnsi="Georgia"/>
-        </w:rPr>
-        <w:t xml:space="preserve">Herbert’s “quantity every clock at rest would agree on” is proper time: the reading an ideal clock accumulates between two events on its own world line is the same in every frame. Barbarian’s point is that every unit is a count of one motion against another. Since 1967 the SI second has been 9,192,631,770 periods of the radiation from the hyperfine transition of the ground state of caesium-133. Before that it was a fraction of the tropical year 1900 (adopted in 1956, made official in 1960), and before that </w:t>
-      </w:r>
-      <w:r>
-        <w:rPr>
-          <w:rFonts w:ascii="Georgia" w:eastAsia="Georgia" w:hAnsi="Georgia"/>
-        </w:rPr>
-        <w:t>a fraction of the mean solar day. Herbert’s watch gets German legal time from the Physikalisch-Technische Bundesanstalt in Braunschweig, carried by the DCF77 longwave time signal transmitted from Mainflingen, south-east of Frankfurt. His “partial order” is the causal structure of spacetime: pairs of events separated in a timelike or lightlike way have an order every observer agrees on; spacelike pairs have none.</w:t>
+        <w:t>Herbert’s “quantity every clock at rest would agree on” is proper time: the reading an ideal clock accumulates between two events on its own world line is the same in every frame. Barbarian’s point is that every unit is a count of one motion against another. Since 1967, the second has been based on the caesium-133 hyperfine transition. In the current SI, its unperturbed frequency is fixed at exactly 9,192,631,770 Hz, so a second is equivalent to that many periods of the corresponding radiation. Before that it was a fraction of the tropical year 1900 (adopted in 1956, made official in 1960), and before that a fraction of the mean solar day. Herbert’s watch gets German legal time from the Physikalisch-Technische Bundesanstalt in Braunschweig, carried by the DCF77 longwave time signal transmitted from Mainflingen, south-east of Frankfurt. His “partial order” is the causal structure of spacetime: pairs of events separated in a timelike or lightlike way have an order every observer agrees on; spacelike pairs have none.</w:t>
       </w:r>
     </w:p>
     <w:p>
@@ -22881,32 +22762,7 @@
         <w:spacing w:after="160" w:line="240" w:lineRule="auto"/>
       </w:pPr>
       <w:r>
-        <w:rPr>
-          <w:rFonts w:ascii="Georgia" w:eastAsia="Georgia" w:hAnsi="Georgia"/>
-        </w:rPr>
-        <w:t xml:space="preserve">Behind the case: what Herbert and Barbarian argue about over twenty clocks in </w:t>
-      </w:r>
-      <w:hyperlink w:anchor="chapter_18">
-        <w:r>
-          <w:rPr>
-            <w:rFonts w:ascii="Georgia" w:eastAsia="Georgia" w:hAnsi="Georgia"/>
-            <w:color w:val="0563C1"/>
-            <w:u w:val="single"/>
-          </w:rPr>
-          <w:t>Chapter 18</w:t>
-        </w:r>
-      </w:hyperlink>
-      <w:r>
-        <w:rPr>
-          <w:rFonts w:ascii="Georgia" w:eastAsia="Georgia" w:hAnsi="Georgia"/>
-        </w:rPr>
-        <w:t>. Every clock is a counter. A pendulum counts swings; since 1967 the SI second has been defined as 9,192,631,770 periods of the radiation from a caesium-133 atom, so every second ever recorded is one motion counted against another. Two good clocks at rest side by side in the office, set to different readings, still agree on the count between the door and the reading. That count, the proper time, is geometry, not convention. The ruled line on Herbert’s squared paper, the office’s world line, is a drawing aid</w:t>
-      </w:r>
-      <w:r>
-        <w:rPr>
-          <w:rFonts w:ascii="Georgia" w:eastAsia="Georgia" w:hAnsi="Georgia"/>
-        </w:rPr>
-        <w:t>: what the evidence supplies is events, their order, and counts where anybody counted. The light cone turns that into a partial order. Pairs that a signal could connect are ordered for every observer. Pairs that no signal could connect are neither before nor after. Without the sender’s place and time, the records cannot establish its causal order, which is why the field stays blank.</w:t>
+        <w:t>Behind the case: what Herbert and Barbarian argue about over twenty clocks in Chapter 18. Every clock is a counter. A pendulum counts swings; since 1967 the second has been based on the caesium-133 hyperfine transition; today, the SI fixes its unperturbed frequency at exactly 9,192,631,770 Hz, equivalent to that many periods of the corresponding radiation, so every second ever recorded is one motion counted against another. Two good clocks at rest side by side in the office, set to different readings, still agree on the count between the door and the reading. That count, the proper time, is geometry, not convention. The ruled line on Herbert’s squared paper, the office’s world line, is a drawing aid: what the evidence supplies is events, their order, and counts where anybody counted. The light cone turns that into a partial order. Pairs that a signal could connect are ordered for every observer. Pairs that no signal could connect are neither before nor after. Without the sender’s place and time, the records cannot establish its causal order, which is why the field stays blank.</w:t>
       </w:r>
     </w:p>
     <w:p>

</xml_diff>

<commit_message>
Make RIB Book 2 readable in any order
</commit_message>
<xml_diff>
--- a/The Relativistic Investigation Bureau - SERIES/Book 2 - The Warning That Was Sent Too Late/The_Warning_That_Was_Sent_Too_Late_BOOK_2_REV05_LINE_EDIT_DRAFT.docx
+++ b/The Relativistic Investigation Bureau - SERIES/Book 2 - The Warning That Was Sent Too Late/The_Warning_That_Was_Sent_Too_Late_BOOK_2_REV05_LINE_EDIT_DRAFT.docx
@@ -101,6 +101,19 @@
         <w:t>Table of Contents</w:t>
       </w:r>
       <w:bookmarkEnd w:id="0"/>
+    </w:p>
+    <w:p>
+      <w:pPr/>
+      <w:hyperlink w:anchor="new_reader_note">
+        <w:r>
+          <w:rPr>
+            <w:rFonts w:ascii="Georgia" w:hAnsi="Georgia"/>
+            <w:color w:val="0563C1"/>
+            <w:u w:val="single"/>
+          </w:rPr>
+          <w:t>A Note for New Readers</w:t>
+        </w:r>
+      </w:hyperlink>
     </w:p>
     <w:p>
       <w:pPr>
@@ -691,98 +704,44 @@
       <w:pPr>
         <w:pStyle w:val="Heading1"/>
         <w:pageBreakBefore/>
-        <w:spacing w:before="320" w:after="200"/>
-        <w:jc w:val="center"/>
-      </w:pPr>
-      <w:bookmarkStart w:id="1" w:name="how_to_read"/>
-      <w:r>
-        <w:rPr>
-          <w:rFonts w:ascii="Amazon Ember" w:eastAsia="Amazon Ember" w:hAnsi="Amazon Ember"/>
-          <w:color w:val="0C447C"/>
-          <w:sz w:val="36"/>
-        </w:rPr>
-        <w:lastRenderedPageBreak/>
-        <w:t>How to Read This Book</w:t>
-      </w:r>
-      <w:bookmarkEnd w:id="1"/>
-    </w:p>
-    <w:p>
-      <w:pPr>
-        <w:spacing w:after="160" w:line="240" w:lineRule="auto"/>
-      </w:pPr>
-      <w:r>
-        <w:t>Welcome to the Bureau. This case stands alone, and no physics background is needed: read on and skip the lesson links. The optional six-lesson course is here only if the story sparks your curiosity.</w:t>
-      </w:r>
-    </w:p>
-    <w:p>
-      <w:pPr>
-        <w:pStyle w:val="Heading2"/>
-        <w:spacing w:before="320" w:after="200"/>
-        <w:jc w:val="center"/>
-      </w:pPr>
-      <w:bookmarkStart w:id="2" w:name="authors_note"/>
-      <w:r>
-        <w:rPr>
-          <w:rFonts w:ascii="Amazon Ember" w:eastAsia="Amazon Ember" w:hAnsi="Amazon Ember"/>
-          <w:color w:val="0C447C"/>
-          <w:sz w:val="28"/>
-        </w:rPr>
-        <w:t>Author’s Note</w:t>
-      </w:r>
-      <w:bookmarkEnd w:id="2"/>
-    </w:p>
-    <w:p>
-      <w:pPr>
-        <w:spacing w:after="160" w:line="240" w:lineRule="auto"/>
-      </w:pPr>
-      <w:r>
-        <w:t>As in the first case, the science and historical details identified below are real; the case is fiction. The relativity used here is well tested in the situations described. Closed timelike curves occur in some mathematical solutions of General Relativity, but none have been observed; the self-consistency principle is a proposal, not an established physical law. The case accounts for the morning sheet’s words, route, and arrival; relativity does not send it from its own future. The platform, Sunday slip, and voice remain open questions.</w:t>
-      </w:r>
-    </w:p>
-    <w:p>
-      <w:pPr>
-        <w:spacing w:after="160" w:line="240" w:lineRule="auto"/>
-      </w:pPr>
-      <w:r>
-        <w:t>Real: the speed of light and what it does, and does not do, to the order of events; the slowing of moving clocks, including the 1971 Hafele–Keating flights, whose caesium clocks came home about 59 billionths of a second behind after flying east and about 273 billionths of a second ahead after flying west; the SI second, tied to the caesium-133 hyperfine transition since 1967 and now defined by fixing its unperturbed frequency at exactly 9,192,631,770 Hz; the DCF77 time signal, broadcast from near Frankfurt for Germany’s national metrology institute, the PTB in Braunschweig; and Paddington station and its airport trains. The films named in the course are real films, and every book in the bibliography exists.</w:t>
-      </w:r>
-    </w:p>
-    <w:p>
-      <w:pPr>
-        <w:spacing w:after="160" w:line="240" w:lineRule="auto"/>
-      </w:pPr>
-      <w:r>
-        <w:rPr>
-          <w:rFonts w:ascii="Georgia" w:eastAsia="Georgia" w:hAnsi="Georgia"/>
-        </w:rPr>
-        <w:t>Invented: the Bureau and everyone in it; the building, its landlord, his surveyor and both insurers; form PL/9 and every other form; the school; the morning sheet and Sunday’s lost-property slip; and the impossible platform in the doorway.</w:t>
-      </w:r>
-    </w:p>
-    <w:p>
-      <w:pPr>
-        <w:spacing w:after="160" w:line="240" w:lineRule="auto"/>
-      </w:pPr>
-      <w:r>
-        <w:rPr>
-          <w:rFonts w:ascii="Georgia" w:eastAsia="Georgia" w:hAnsi="Georgia"/>
-        </w:rPr>
-        <w:t>Weinstein’s night train is real. The Sud Expresso (the Sud Express, in French) ran overnight from the French–Spanish border at Hendaye and Irún, across Spain, to Lisbon, and entered Portugal at Vilar Formoso. It was suspended on 17 March 2020 amid the pandemic and border closures. That is why Weinstein speaks of it in the past tense. The border clocks are real too: mainland Portugal moved to Central European Time, Spain’s time, in September 1992, and went back to Western European Time in 1996. A government can move every clock in a country by an hour with a signature. It cannot make one of them tick slower.</w:t>
-      </w:r>
-      <w:r>
-        <w:rPr>
-          <w:rFonts w:ascii="Georgia" w:eastAsia="Georgia" w:hAnsi="Georgia"/>
-        </w:rPr>
-      </w:r>
-    </w:p>
-    <w:p>
-      <w:pPr>
-        <w:spacing w:after="160" w:line="240" w:lineRule="auto"/>
-      </w:pPr>
-      <w:r>
-        <w:rPr>
-          <w:rFonts w:ascii="Georgia" w:eastAsia="Georgia" w:hAnsi="Georgia"/>
-        </w:rPr>
-        <w:t>If you finish the book unsure whether a warning can be early and late at once, congratulations. You are thinking like an investigator. The Bureau files that under Lesson 6.</w:t>
+      </w:pPr>
+      <w:bookmarkStart w:id="54" w:name="new_reader_note"/>
+      <w:r>
+        <w:t>A Note for New Readers</w:t>
+      </w:r>
+      <w:bookmarkEnd w:id="54"/>
+    </w:p>
+    <w:p>
+      <w:pPr/>
+      <w:r>
+        <w:t xml:space="preserve">You can start with either Bureau mystery. Each book follows a complete investigation, and you need no previous case file to follow this one. If you prefer publication order, begin with </w:t>
+      </w:r>
+      <w:r>
+        <w:rPr>
+          <w:i/>
+        </w:rPr>
+        <w:t>The Murder That Hadn’t Happened Yet</w:t>
+      </w:r>
+      <w:r>
+        <w:t>.</w:t>
+      </w:r>
+    </w:p>
+    <w:p>
+      <w:pPr/>
+      <w:r>
+        <w:t>Book 1 is a complete case in its own right. It leaves one piece of Bureau paperwork—the account labelled LOCALHOST—unexplained. That thread belongs to the wider series; it did not send the warning in this book.</w:t>
+      </w:r>
+    </w:p>
+    <w:p>
+      <w:pPr/>
+      <w:r>
+        <w:t>Derek Gent is the investigator. His cousin Penny is quick to test the order of events; Trevor Boltzman is the team’s mathematician and dependable tape-measure carrier; Alfred Weinstein is a Munich patent attorney who spots the question everyone else has missed. Mrs Marsh runs the building and treats impossible architecture as a tenancy matter. Sophie is Derek’s daughter; Tuppence is Sophie’s mother and Derek’s former partner; Tabitha is Trevor’s sister. Sherlock is the Bureau’s remote consultant, a dolphin: he comments, while Derek and Penny close the case.</w:t>
+      </w:r>
+    </w:p>
+    <w:p>
+      <w:pPr/>
+      <w:r>
+        <w:t>The central case reaches its own answer. The doorway railway, the Sunday slip, and the late voice remain open questions for the series, not missing pieces required to follow this case.</w:t>
       </w:r>
     </w:p>
     <w:p>
@@ -792,6 +751,104 @@
         <w:spacing w:before="320" w:after="200"/>
         <w:jc w:val="center"/>
       </w:pPr>
+      <w:bookmarkStart w:id="1" w:name="how_to_read"/>
+      <w:r>
+        <w:rPr>
+          <w:rFonts w:ascii="Amazon Ember" w:eastAsia="Amazon Ember" w:hAnsi="Amazon Ember"/>
+          <w:color w:val="0C447C"/>
+          <w:sz w:val="36"/>
+        </w:rPr>
+        <w:lastRenderedPageBreak/>
+        <w:t>How to Read This Book</w:t>
+      </w:r>
+      <w:bookmarkEnd w:id="1"/>
+    </w:p>
+    <w:p>
+      <w:pPr>
+        <w:spacing w:after="160" w:line="240" w:lineRule="auto"/>
+      </w:pPr>
+      <w:r>
+        <w:t>No physics background is needed. The six-lesson course is optional: skip the lesson links as you read, and return only if the story sparks your curiosity.</w:t>
+      </w:r>
+    </w:p>
+    <w:p>
+      <w:pPr>
+        <w:pStyle w:val="Heading2"/>
+        <w:spacing w:before="320" w:after="200"/>
+        <w:jc w:val="center"/>
+      </w:pPr>
+      <w:bookmarkStart w:id="2" w:name="authors_note"/>
+      <w:r>
+        <w:rPr>
+          <w:rFonts w:ascii="Amazon Ember" w:eastAsia="Amazon Ember" w:hAnsi="Amazon Ember"/>
+          <w:color w:val="0C447C"/>
+          <w:sz w:val="28"/>
+        </w:rPr>
+        <w:t>Author’s Note</w:t>
+      </w:r>
+      <w:bookmarkEnd w:id="2"/>
+    </w:p>
+    <w:p>
+      <w:pPr>
+        <w:spacing w:after="160" w:line="240" w:lineRule="auto"/>
+      </w:pPr>
+      <w:r>
+        <w:t>As in the first case, the science and historical details identified below are real; the case is fiction. The relativity used here is well tested in the situations described. Closed timelike curves occur in some mathematical solutions of General Relativity, but none have been observed; the self-consistency principle is a proposal, not an established physical law. The case accounts for the morning sheet’s words, route, and arrival; relativity does not send it from its own future. The platform, Sunday slip, and voice remain open questions.</w:t>
+      </w:r>
+    </w:p>
+    <w:p>
+      <w:pPr>
+        <w:spacing w:after="160" w:line="240" w:lineRule="auto"/>
+      </w:pPr>
+      <w:r>
+        <w:t>Real: the speed of light and what it does, and does not do, to the order of events; the slowing of moving clocks, including the 1971 Hafele–Keating flights, whose caesium clocks came home about 59 billionths of a second behind after flying east and about 273 billionths of a second ahead after flying west; the SI second, tied to the caesium-133 hyperfine transition since 1967 and now defined by fixing its unperturbed frequency at exactly 9,192,631,770 Hz; the DCF77 time signal, broadcast from near Frankfurt for Germany’s national metrology institute, the PTB in Braunschweig; and Paddington station and its airport trains. The films named in the course are real films, and every book in the bibliography exists.</w:t>
+      </w:r>
+    </w:p>
+    <w:p>
+      <w:pPr>
+        <w:spacing w:after="160" w:line="240" w:lineRule="auto"/>
+      </w:pPr>
+      <w:r>
+        <w:rPr>
+          <w:rFonts w:ascii="Georgia" w:eastAsia="Georgia" w:hAnsi="Georgia"/>
+        </w:rPr>
+        <w:t>Invented: the Bureau and everyone in it; the building, its landlord, his surveyor and both insurers; form PL/9 and every other form; the school; the morning sheet and Sunday’s lost-property slip; and the impossible platform in the doorway.</w:t>
+      </w:r>
+    </w:p>
+    <w:p>
+      <w:pPr>
+        <w:spacing w:after="160" w:line="240" w:lineRule="auto"/>
+      </w:pPr>
+      <w:r>
+        <w:rPr>
+          <w:rFonts w:ascii="Georgia" w:eastAsia="Georgia" w:hAnsi="Georgia"/>
+        </w:rPr>
+        <w:t>Weinstein’s night train is real. The Sud Expresso (the Sud Express, in French) ran overnight from the French–Spanish border at Hendaye and Irún, across Spain, to Lisbon, and entered Portugal at Vilar Formoso. It was suspended on 17 March 2020 amid the pandemic and border closures. That is why Weinstein speaks of it in the past tense. The border clocks are real too: mainland Portugal moved to Central European Time, Spain’s time, in September 1992, and went back to Western European Time in 1996. A government can move every clock in a country by an hour with a signature. It cannot make one of them tick slower.</w:t>
+      </w:r>
+      <w:r>
+        <w:rPr>
+          <w:rFonts w:ascii="Georgia" w:eastAsia="Georgia" w:hAnsi="Georgia"/>
+        </w:rPr>
+      </w:r>
+    </w:p>
+    <w:p>
+      <w:pPr>
+        <w:spacing w:after="160" w:line="240" w:lineRule="auto"/>
+      </w:pPr>
+      <w:r>
+        <w:rPr>
+          <w:rFonts w:ascii="Georgia" w:eastAsia="Georgia" w:hAnsi="Georgia"/>
+        </w:rPr>
+        <w:t>If you finish the book unsure whether a warning can be early and late at once, congratulations. You are thinking like an investigator. The Bureau files that under Lesson 6.</w:t>
+      </w:r>
+    </w:p>
+    <w:p>
+      <w:pPr>
+        <w:pStyle w:val="Heading1"/>
+        <w:pageBreakBefore/>
+        <w:spacing w:before="320" w:after="200"/>
+        <w:jc w:val="center"/>
+      </w:pPr>
       <w:bookmarkStart w:id="3" w:name="prologue"/>
       <w:r>
         <w:rPr>
@@ -834,16 +891,7 @@
         <w:spacing w:after="160" w:line="240" w:lineRule="auto"/>
       </w:pPr>
       <w:r>
-        <w:rPr>
-          <w:rFonts w:ascii="Georgia" w:eastAsia="Georgia" w:hAnsi="Georgia"/>
-        </w:rPr>
-        <w:t>At the time, the Relativistic Investigation Bureau was busy closing a murder that had never happened. Case 1047 lay on Derek Gent’s desk for the last time: a fat buff folder; an email received at 9:17 one Tuesday morning, YOU HAVE BEEN MURDERED. THE PERPETRATOR IS YOU; and a photograph of his office doorway with his daughter standing in it, sent by the Bureau’s own case system, CASEBOOK, from an address that called itself LOCALHOST. It had taken a week, four clocks, a professor in Munich and most of Derek’s</w:t>
-      </w:r>
-      <w:r>
-        <w:rPr>
-          <w:rFonts w:ascii="Georgia" w:eastAsia="Georgia" w:hAnsi="Georgia"/>
-        </w:rPr>
-        <w:t xml:space="preserve"> patience to establish that nobody had been murdered. CASEBOOK had filled its empty fields with whatever was nearest, and a phone nobody could name had been looking through the Bureau’s camera. The phone was still nobody. The email had been wrong about everything except the time.</w:t>
+        <w:t>At the time, the Relativistic Investigation Bureau was closing the file that had occupied it all last week. Case 1047 lay on Derek Gent’s desk for the last time: a fat buff folder; an email received at 9:17 one Tuesday morning, YOU HAVE BEEN MURDERED. THE PERPETRATOR IS YOU; and a photograph of his office doorway with his daughter standing in it, sent by the Bureau’s own case system, CASEBOOK, from an address that called itself LOCALHOST. It had taken a week, four clocks, a professor in Munich and most of Derek’s patience to close the case. CASEBOOK had filled its empty fields with whatever was nearest, and a phone nobody could name had been looking through the Bureau’s camera. The phone was still nobody.</w:t>
       </w:r>
     </w:p>
     <w:p>

</xml_diff>

<commit_message>
Sync RIB series files and archive replaced copies
</commit_message>
<xml_diff>
--- a/The Relativistic Investigation Bureau - SERIES/Book 2 - The Warning That Was Sent Too Late/The_Warning_That_Was_Sent_Too_Late_BOOK_2_REV05_LINE_EDIT_DRAFT.docx
+++ b/The Relativistic Investigation Bureau - SERIES/Book 2 - The Warning That Was Sent Too Late/The_Warning_That_Was_Sent_Too_Late_BOOK_2_REV05_LINE_EDIT_DRAFT.docx
@@ -101,19 +101,6 @@
         <w:t>Table of Contents</w:t>
       </w:r>
       <w:bookmarkEnd w:id="0"/>
-    </w:p>
-    <w:p>
-      <w:pPr/>
-      <w:hyperlink w:anchor="new_reader_note">
-        <w:r>
-          <w:rPr>
-            <w:rFonts w:ascii="Georgia" w:hAnsi="Georgia"/>
-            <w:color w:val="0563C1"/>
-            <w:u w:val="single"/>
-          </w:rPr>
-          <w:t>A Note for New Readers</w:t>
-        </w:r>
-      </w:hyperlink>
     </w:p>
     <w:p>
       <w:pPr>
@@ -704,44 +691,98 @@
       <w:pPr>
         <w:pStyle w:val="Heading1"/>
         <w:pageBreakBefore/>
-      </w:pPr>
-      <w:bookmarkStart w:id="54" w:name="new_reader_note"/>
-      <w:r>
-        <w:t>A Note for New Readers</w:t>
-      </w:r>
-      <w:bookmarkEnd w:id="54"/>
-    </w:p>
-    <w:p>
-      <w:pPr/>
-      <w:r>
-        <w:t xml:space="preserve">You can start with either Bureau mystery. Each book follows a complete investigation, and you need no previous case file to follow this one. If you prefer publication order, begin with </w:t>
-      </w:r>
-      <w:r>
-        <w:rPr>
-          <w:i/>
-        </w:rPr>
-        <w:t>The Murder That Hadn’t Happened Yet</w:t>
-      </w:r>
-      <w:r>
-        <w:t>.</w:t>
-      </w:r>
-    </w:p>
-    <w:p>
-      <w:pPr/>
-      <w:r>
-        <w:t>Book 1 is a complete case in its own right. It leaves one piece of Bureau paperwork—the account labelled LOCALHOST—unexplained. That thread belongs to the wider series; it did not send the warning in this book.</w:t>
-      </w:r>
-    </w:p>
-    <w:p>
-      <w:pPr/>
-      <w:r>
-        <w:t>Derek Gent is the investigator. His cousin Penny is quick to test the order of events; Trevor Boltzman is the team’s mathematician and dependable tape-measure carrier; Alfred Weinstein is a Munich patent attorney who spots the question everyone else has missed. Mrs Marsh runs the building and treats impossible architecture as a tenancy matter. Sophie is Derek’s daughter; Tuppence is Sophie’s mother and Derek’s former partner; Tabitha is Trevor’s sister. Sherlock is the Bureau’s remote consultant, a dolphin: he comments, while Derek and Penny close the case.</w:t>
-      </w:r>
-    </w:p>
-    <w:p>
-      <w:pPr/>
-      <w:r>
-        <w:t>The central case reaches its own answer. The doorway railway, the Sunday slip, and the late voice remain open questions for the series, not missing pieces required to follow this case.</w:t>
+        <w:spacing w:before="320" w:after="200"/>
+        <w:jc w:val="center"/>
+      </w:pPr>
+      <w:bookmarkStart w:id="1" w:name="how_to_read"/>
+      <w:r>
+        <w:rPr>
+          <w:rFonts w:ascii="Amazon Ember" w:eastAsia="Amazon Ember" w:hAnsi="Amazon Ember"/>
+          <w:color w:val="0C447C"/>
+          <w:sz w:val="36"/>
+        </w:rPr>
+        <w:lastRenderedPageBreak/>
+        <w:t>How to Read This Book</w:t>
+      </w:r>
+      <w:bookmarkEnd w:id="1"/>
+    </w:p>
+    <w:p>
+      <w:pPr>
+        <w:spacing w:after="160" w:line="240" w:lineRule="auto"/>
+      </w:pPr>
+      <w:r>
+        <w:t>Welcome to the Bureau. This case stands alone, and no physics background is needed: read on and skip the lesson links. The optional six-lesson course is here only if the story sparks your curiosity.</w:t>
+      </w:r>
+    </w:p>
+    <w:p>
+      <w:pPr>
+        <w:pStyle w:val="Heading2"/>
+        <w:spacing w:before="320" w:after="200"/>
+        <w:jc w:val="center"/>
+      </w:pPr>
+      <w:bookmarkStart w:id="2" w:name="authors_note"/>
+      <w:r>
+        <w:rPr>
+          <w:rFonts w:ascii="Amazon Ember" w:eastAsia="Amazon Ember" w:hAnsi="Amazon Ember"/>
+          <w:color w:val="0C447C"/>
+          <w:sz w:val="28"/>
+        </w:rPr>
+        <w:t>Author’s Note</w:t>
+      </w:r>
+      <w:bookmarkEnd w:id="2"/>
+    </w:p>
+    <w:p>
+      <w:pPr>
+        <w:spacing w:after="160" w:line="240" w:lineRule="auto"/>
+      </w:pPr>
+      <w:r>
+        <w:t>As in the first case, the science and historical details identified below are real; the case is fiction. The relativity used here is well tested in the situations described. Closed timelike curves occur in some mathematical solutions of General Relativity, but none have been observed; the self-consistency principle is a proposal, not an established physical law. The case accounts for the morning sheet’s words, route, and arrival; relativity does not send it from its own future. The platform, Sunday slip, and voice remain open questions.</w:t>
+      </w:r>
+    </w:p>
+    <w:p>
+      <w:pPr>
+        <w:spacing w:after="160" w:line="240" w:lineRule="auto"/>
+      </w:pPr>
+      <w:r>
+        <w:t>Real: the speed of light and what it does, and does not do, to the order of events; the slowing of moving clocks, including the 1971 Hafele–Keating flights, whose caesium clocks came home about 59 billionths of a second behind after flying east and about 273 billionths of a second ahead after flying west; the SI second, tied to the caesium-133 hyperfine transition since 1967 and now defined by fixing its unperturbed frequency at exactly 9,192,631,770 Hz; the DCF77 time signal, broadcast from near Frankfurt for Germany’s national metrology institute, the PTB in Braunschweig; and Paddington station and its airport trains. The films named in the course are real films, and every book in the bibliography exists.</w:t>
+      </w:r>
+    </w:p>
+    <w:p>
+      <w:pPr>
+        <w:spacing w:after="160" w:line="240" w:lineRule="auto"/>
+      </w:pPr>
+      <w:r>
+        <w:rPr>
+          <w:rFonts w:ascii="Georgia" w:eastAsia="Georgia" w:hAnsi="Georgia"/>
+        </w:rPr>
+        <w:t>Invented: the Bureau and everyone in it; the building, its landlord, his surveyor and both insurers; form PL/9 and every other form; the school; the morning sheet and Sunday’s lost-property slip; and the impossible platform in the doorway.</w:t>
+      </w:r>
+    </w:p>
+    <w:p>
+      <w:pPr>
+        <w:spacing w:after="160" w:line="240" w:lineRule="auto"/>
+      </w:pPr>
+      <w:r>
+        <w:rPr>
+          <w:rFonts w:ascii="Georgia" w:eastAsia="Georgia" w:hAnsi="Georgia"/>
+        </w:rPr>
+        <w:t>Weinstein’s night train is real. The Sud Expresso (the Sud Express, in French) ran overnight from the French–Spanish border at Hendaye and Irún, across Spain, to Lisbon, and entered Portugal at Vilar Formoso. It was suspended on 17 March 2020 amid the pandemic and border closures. That is why Weinstein speaks of it in the past tense. The border clocks are real too: mainland Portugal moved to Central European Time, Spain’s time, in September 1992, and went back to Western European Time in 1996. A government can move every clock in a country by an hour with a signature. It cannot make one of them tick slower.</w:t>
+      </w:r>
+      <w:r>
+        <w:rPr>
+          <w:rFonts w:ascii="Georgia" w:eastAsia="Georgia" w:hAnsi="Georgia"/>
+        </w:rPr>
+      </w:r>
+    </w:p>
+    <w:p>
+      <w:pPr>
+        <w:spacing w:after="160" w:line="240" w:lineRule="auto"/>
+      </w:pPr>
+      <w:r>
+        <w:rPr>
+          <w:rFonts w:ascii="Georgia" w:eastAsia="Georgia" w:hAnsi="Georgia"/>
+        </w:rPr>
+        <w:t>If you finish the book unsure whether a warning can be early and late at once, congratulations. You are thinking like an investigator. The Bureau files that under Lesson 6.</w:t>
       </w:r>
     </w:p>
     <w:p>
@@ -751,104 +792,6 @@
         <w:spacing w:before="320" w:after="200"/>
         <w:jc w:val="center"/>
       </w:pPr>
-      <w:bookmarkStart w:id="1" w:name="how_to_read"/>
-      <w:r>
-        <w:rPr>
-          <w:rFonts w:ascii="Amazon Ember" w:eastAsia="Amazon Ember" w:hAnsi="Amazon Ember"/>
-          <w:color w:val="0C447C"/>
-          <w:sz w:val="36"/>
-        </w:rPr>
-        <w:lastRenderedPageBreak/>
-        <w:t>How to Read This Book</w:t>
-      </w:r>
-      <w:bookmarkEnd w:id="1"/>
-    </w:p>
-    <w:p>
-      <w:pPr>
-        <w:spacing w:after="160" w:line="240" w:lineRule="auto"/>
-      </w:pPr>
-      <w:r>
-        <w:t>No physics background is needed. The six-lesson course is optional: skip the lesson links as you read, and return only if the story sparks your curiosity.</w:t>
-      </w:r>
-    </w:p>
-    <w:p>
-      <w:pPr>
-        <w:pStyle w:val="Heading2"/>
-        <w:spacing w:before="320" w:after="200"/>
-        <w:jc w:val="center"/>
-      </w:pPr>
-      <w:bookmarkStart w:id="2" w:name="authors_note"/>
-      <w:r>
-        <w:rPr>
-          <w:rFonts w:ascii="Amazon Ember" w:eastAsia="Amazon Ember" w:hAnsi="Amazon Ember"/>
-          <w:color w:val="0C447C"/>
-          <w:sz w:val="28"/>
-        </w:rPr>
-        <w:t>Author’s Note</w:t>
-      </w:r>
-      <w:bookmarkEnd w:id="2"/>
-    </w:p>
-    <w:p>
-      <w:pPr>
-        <w:spacing w:after="160" w:line="240" w:lineRule="auto"/>
-      </w:pPr>
-      <w:r>
-        <w:t>As in the first case, the science and historical details identified below are real; the case is fiction. The relativity used here is well tested in the situations described. Closed timelike curves occur in some mathematical solutions of General Relativity, but none have been observed; the self-consistency principle is a proposal, not an established physical law. The case accounts for the morning sheet’s words, route, and arrival; relativity does not send it from its own future. The platform, Sunday slip, and voice remain open questions.</w:t>
-      </w:r>
-    </w:p>
-    <w:p>
-      <w:pPr>
-        <w:spacing w:after="160" w:line="240" w:lineRule="auto"/>
-      </w:pPr>
-      <w:r>
-        <w:t>Real: the speed of light and what it does, and does not do, to the order of events; the slowing of moving clocks, including the 1971 Hafele–Keating flights, whose caesium clocks came home about 59 billionths of a second behind after flying east and about 273 billionths of a second ahead after flying west; the SI second, tied to the caesium-133 hyperfine transition since 1967 and now defined by fixing its unperturbed frequency at exactly 9,192,631,770 Hz; the DCF77 time signal, broadcast from near Frankfurt for Germany’s national metrology institute, the PTB in Braunschweig; and Paddington station and its airport trains. The films named in the course are real films, and every book in the bibliography exists.</w:t>
-      </w:r>
-    </w:p>
-    <w:p>
-      <w:pPr>
-        <w:spacing w:after="160" w:line="240" w:lineRule="auto"/>
-      </w:pPr>
-      <w:r>
-        <w:rPr>
-          <w:rFonts w:ascii="Georgia" w:eastAsia="Georgia" w:hAnsi="Georgia"/>
-        </w:rPr>
-        <w:t>Invented: the Bureau and everyone in it; the building, its landlord, his surveyor and both insurers; form PL/9 and every other form; the school; the morning sheet and Sunday’s lost-property slip; and the impossible platform in the doorway.</w:t>
-      </w:r>
-    </w:p>
-    <w:p>
-      <w:pPr>
-        <w:spacing w:after="160" w:line="240" w:lineRule="auto"/>
-      </w:pPr>
-      <w:r>
-        <w:rPr>
-          <w:rFonts w:ascii="Georgia" w:eastAsia="Georgia" w:hAnsi="Georgia"/>
-        </w:rPr>
-        <w:t>Weinstein’s night train is real. The Sud Expresso (the Sud Express, in French) ran overnight from the French–Spanish border at Hendaye and Irún, across Spain, to Lisbon, and entered Portugal at Vilar Formoso. It was suspended on 17 March 2020 amid the pandemic and border closures. That is why Weinstein speaks of it in the past tense. The border clocks are real too: mainland Portugal moved to Central European Time, Spain’s time, in September 1992, and went back to Western European Time in 1996. A government can move every clock in a country by an hour with a signature. It cannot make one of them tick slower.</w:t>
-      </w:r>
-      <w:r>
-        <w:rPr>
-          <w:rFonts w:ascii="Georgia" w:eastAsia="Georgia" w:hAnsi="Georgia"/>
-        </w:rPr>
-      </w:r>
-    </w:p>
-    <w:p>
-      <w:pPr>
-        <w:spacing w:after="160" w:line="240" w:lineRule="auto"/>
-      </w:pPr>
-      <w:r>
-        <w:rPr>
-          <w:rFonts w:ascii="Georgia" w:eastAsia="Georgia" w:hAnsi="Georgia"/>
-        </w:rPr>
-        <w:t>If you finish the book unsure whether a warning can be early and late at once, congratulations. You are thinking like an investigator. The Bureau files that under Lesson 6.</w:t>
-      </w:r>
-    </w:p>
-    <w:p>
-      <w:pPr>
-        <w:pStyle w:val="Heading1"/>
-        <w:pageBreakBefore/>
-        <w:spacing w:before="320" w:after="200"/>
-        <w:jc w:val="center"/>
-      </w:pPr>
       <w:bookmarkStart w:id="3" w:name="prologue"/>
       <w:r>
         <w:rPr>
@@ -891,7 +834,16 @@
         <w:spacing w:after="160" w:line="240" w:lineRule="auto"/>
       </w:pPr>
       <w:r>
-        <w:t>At the time, the Relativistic Investigation Bureau was closing the file that had occupied it all last week. Case 1047 lay on Derek Gent’s desk for the last time: a fat buff folder; an email received at 9:17 one Tuesday morning, YOU HAVE BEEN MURDERED. THE PERPETRATOR IS YOU; and a photograph of his office doorway with his daughter standing in it, sent by the Bureau’s own case system, CASEBOOK, from an address that called itself LOCALHOST. It had taken a week, four clocks, a professor in Munich and most of Derek’s patience to close the case. CASEBOOK had filled its empty fields with whatever was nearest, and a phone nobody could name had been looking through the Bureau’s camera. The phone was still nobody.</w:t>
+        <w:rPr>
+          <w:rFonts w:ascii="Georgia" w:eastAsia="Georgia" w:hAnsi="Georgia"/>
+        </w:rPr>
+        <w:t>At the time, the Relativistic Investigation Bureau was busy closing a murder that had never happened. Case 1047 lay on Derek Gent’s desk for the last time: a fat buff folder; an email received at 9:17 one Tuesday morning, YOU HAVE BEEN MURDERED. THE PERPETRATOR IS YOU; and a photograph of his office doorway with his daughter standing in it, sent by the Bureau’s own case system, CASEBOOK, from an address that called itself LOCALHOST. It had taken a week, four clocks, a professor in Munich and most of Derek’s</w:t>
+      </w:r>
+      <w:r>
+        <w:rPr>
+          <w:rFonts w:ascii="Georgia" w:eastAsia="Georgia" w:hAnsi="Georgia"/>
+        </w:rPr>
+        <w:t xml:space="preserve"> patience to establish that nobody had been murdered. CASEBOOK had filled its empty fields with whatever was nearest, and a phone nobody could name had been looking through the Bureau’s camera. The phone was still nobody. The email had been wrong about everything except the time.</w:t>
       </w:r>
     </w:p>
     <w:p>
@@ -21150,7 +21102,7 @@
         <w:rPr>
           <w:rFonts w:ascii="Georgia" w:eastAsia="Georgia" w:hAnsi="Georgia"/>
         </w:rPr>
-        <w:t>At half past six on Tuesday Gucci arrived with Tabitha.</w:t>
+        <w:t>At half past six Gucci arrived with Tabitha.</w:t>
       </w:r>
     </w:p>
     <w:p>

</xml_diff>

<commit_message>
Sync RIB series files and archive replaced copies (#203)
* Sync RIB series files and archive replaced copies

* Update RIB handoff for synchronized revisions
</commit_message>
<xml_diff>
--- a/The Relativistic Investigation Bureau - SERIES/Book 2 - The Warning That Was Sent Too Late/The_Warning_That_Was_Sent_Too_Late_BOOK_2_REV05_LINE_EDIT_DRAFT.docx
+++ b/The Relativistic Investigation Bureau - SERIES/Book 2 - The Warning That Was Sent Too Late/The_Warning_That_Was_Sent_Too_Late_BOOK_2_REV05_LINE_EDIT_DRAFT.docx
@@ -101,19 +101,6 @@
         <w:t>Table of Contents</w:t>
       </w:r>
       <w:bookmarkEnd w:id="0"/>
-    </w:p>
-    <w:p>
-      <w:pPr/>
-      <w:hyperlink w:anchor="new_reader_note">
-        <w:r>
-          <w:rPr>
-            <w:rFonts w:ascii="Georgia" w:hAnsi="Georgia"/>
-            <w:color w:val="0563C1"/>
-            <w:u w:val="single"/>
-          </w:rPr>
-          <w:t>A Note for New Readers</w:t>
-        </w:r>
-      </w:hyperlink>
     </w:p>
     <w:p>
       <w:pPr>
@@ -704,44 +691,98 @@
       <w:pPr>
         <w:pStyle w:val="Heading1"/>
         <w:pageBreakBefore/>
-      </w:pPr>
-      <w:bookmarkStart w:id="54" w:name="new_reader_note"/>
-      <w:r>
-        <w:t>A Note for New Readers</w:t>
-      </w:r>
-      <w:bookmarkEnd w:id="54"/>
-    </w:p>
-    <w:p>
-      <w:pPr/>
-      <w:r>
-        <w:t xml:space="preserve">You can start with either Bureau mystery. Each book follows a complete investigation, and you need no previous case file to follow this one. If you prefer publication order, begin with </w:t>
-      </w:r>
-      <w:r>
-        <w:rPr>
-          <w:i/>
-        </w:rPr>
-        <w:t>The Murder That Hadn’t Happened Yet</w:t>
-      </w:r>
-      <w:r>
-        <w:t>.</w:t>
-      </w:r>
-    </w:p>
-    <w:p>
-      <w:pPr/>
-      <w:r>
-        <w:t>Book 1 is a complete case in its own right. It leaves one piece of Bureau paperwork—the account labelled LOCALHOST—unexplained. That thread belongs to the wider series; it did not send the warning in this book.</w:t>
-      </w:r>
-    </w:p>
-    <w:p>
-      <w:pPr/>
-      <w:r>
-        <w:t>Derek Gent is the investigator. His cousin Penny is quick to test the order of events; Trevor Boltzman is the team’s mathematician and dependable tape-measure carrier; Alfred Weinstein is a Munich patent attorney who spots the question everyone else has missed. Mrs Marsh runs the building and treats impossible architecture as a tenancy matter. Sophie is Derek’s daughter; Tuppence is Sophie’s mother and Derek’s former partner; Tabitha is Trevor’s sister. Sherlock is the Bureau’s remote consultant, a dolphin: he comments, while Derek and Penny close the case.</w:t>
-      </w:r>
-    </w:p>
-    <w:p>
-      <w:pPr/>
-      <w:r>
-        <w:t>The central case reaches its own answer. The doorway railway, the Sunday slip, and the late voice remain open questions for the series, not missing pieces required to follow this case.</w:t>
+        <w:spacing w:before="320" w:after="200"/>
+        <w:jc w:val="center"/>
+      </w:pPr>
+      <w:bookmarkStart w:id="1" w:name="how_to_read"/>
+      <w:r>
+        <w:rPr>
+          <w:rFonts w:ascii="Amazon Ember" w:eastAsia="Amazon Ember" w:hAnsi="Amazon Ember"/>
+          <w:color w:val="0C447C"/>
+          <w:sz w:val="36"/>
+        </w:rPr>
+        <w:lastRenderedPageBreak/>
+        <w:t>How to Read This Book</w:t>
+      </w:r>
+      <w:bookmarkEnd w:id="1"/>
+    </w:p>
+    <w:p>
+      <w:pPr>
+        <w:spacing w:after="160" w:line="240" w:lineRule="auto"/>
+      </w:pPr>
+      <w:r>
+        <w:t>Welcome to the Bureau. This case stands alone, and no physics background is needed: read on and skip the lesson links. The optional six-lesson course is here only if the story sparks your curiosity.</w:t>
+      </w:r>
+    </w:p>
+    <w:p>
+      <w:pPr>
+        <w:pStyle w:val="Heading2"/>
+        <w:spacing w:before="320" w:after="200"/>
+        <w:jc w:val="center"/>
+      </w:pPr>
+      <w:bookmarkStart w:id="2" w:name="authors_note"/>
+      <w:r>
+        <w:rPr>
+          <w:rFonts w:ascii="Amazon Ember" w:eastAsia="Amazon Ember" w:hAnsi="Amazon Ember"/>
+          <w:color w:val="0C447C"/>
+          <w:sz w:val="28"/>
+        </w:rPr>
+        <w:t>Author’s Note</w:t>
+      </w:r>
+      <w:bookmarkEnd w:id="2"/>
+    </w:p>
+    <w:p>
+      <w:pPr>
+        <w:spacing w:after="160" w:line="240" w:lineRule="auto"/>
+      </w:pPr>
+      <w:r>
+        <w:t>As in the first case, the science and historical details identified below are real; the case is fiction. The relativity used here is well tested in the situations described. Closed timelike curves occur in some mathematical solutions of General Relativity, but none have been observed; the self-consistency principle is a proposal, not an established physical law. The case accounts for the morning sheet’s words, route, and arrival; relativity does not send it from its own future. The platform, Sunday slip, and voice remain open questions.</w:t>
+      </w:r>
+    </w:p>
+    <w:p>
+      <w:pPr>
+        <w:spacing w:after="160" w:line="240" w:lineRule="auto"/>
+      </w:pPr>
+      <w:r>
+        <w:t>Real: the speed of light and what it does, and does not do, to the order of events; the slowing of moving clocks, including the 1971 Hafele–Keating flights, whose caesium clocks came home about 59 billionths of a second behind after flying east and about 273 billionths of a second ahead after flying west; the SI second, tied to the caesium-133 hyperfine transition since 1967 and now defined by fixing its unperturbed frequency at exactly 9,192,631,770 Hz; the DCF77 time signal, broadcast from near Frankfurt for Germany’s national metrology institute, the PTB in Braunschweig; and Paddington station and its airport trains. The films named in the course are real films, and every book in the bibliography exists.</w:t>
+      </w:r>
+    </w:p>
+    <w:p>
+      <w:pPr>
+        <w:spacing w:after="160" w:line="240" w:lineRule="auto"/>
+      </w:pPr>
+      <w:r>
+        <w:rPr>
+          <w:rFonts w:ascii="Georgia" w:eastAsia="Georgia" w:hAnsi="Georgia"/>
+        </w:rPr>
+        <w:t>Invented: the Bureau and everyone in it; the building, its landlord, his surveyor and both insurers; form PL/9 and every other form; the school; the morning sheet and Sunday’s lost-property slip; and the impossible platform in the doorway.</w:t>
+      </w:r>
+    </w:p>
+    <w:p>
+      <w:pPr>
+        <w:spacing w:after="160" w:line="240" w:lineRule="auto"/>
+      </w:pPr>
+      <w:r>
+        <w:rPr>
+          <w:rFonts w:ascii="Georgia" w:eastAsia="Georgia" w:hAnsi="Georgia"/>
+        </w:rPr>
+        <w:t>Weinstein’s night train is real. The Sud Expresso (the Sud Express, in French) ran overnight from the French–Spanish border at Hendaye and Irún, across Spain, to Lisbon, and entered Portugal at Vilar Formoso. It was suspended on 17 March 2020 amid the pandemic and border closures. That is why Weinstein speaks of it in the past tense. The border clocks are real too: mainland Portugal moved to Central European Time, Spain’s time, in September 1992, and went back to Western European Time in 1996. A government can move every clock in a country by an hour with a signature. It cannot make one of them tick slower.</w:t>
+      </w:r>
+      <w:r>
+        <w:rPr>
+          <w:rFonts w:ascii="Georgia" w:eastAsia="Georgia" w:hAnsi="Georgia"/>
+        </w:rPr>
+      </w:r>
+    </w:p>
+    <w:p>
+      <w:pPr>
+        <w:spacing w:after="160" w:line="240" w:lineRule="auto"/>
+      </w:pPr>
+      <w:r>
+        <w:rPr>
+          <w:rFonts w:ascii="Georgia" w:eastAsia="Georgia" w:hAnsi="Georgia"/>
+        </w:rPr>
+        <w:t>If you finish the book unsure whether a warning can be early and late at once, congratulations. You are thinking like an investigator. The Bureau files that under Lesson 6.</w:t>
       </w:r>
     </w:p>
     <w:p>
@@ -751,104 +792,6 @@
         <w:spacing w:before="320" w:after="200"/>
         <w:jc w:val="center"/>
       </w:pPr>
-      <w:bookmarkStart w:id="1" w:name="how_to_read"/>
-      <w:r>
-        <w:rPr>
-          <w:rFonts w:ascii="Amazon Ember" w:eastAsia="Amazon Ember" w:hAnsi="Amazon Ember"/>
-          <w:color w:val="0C447C"/>
-          <w:sz w:val="36"/>
-        </w:rPr>
-        <w:lastRenderedPageBreak/>
-        <w:t>How to Read This Book</w:t>
-      </w:r>
-      <w:bookmarkEnd w:id="1"/>
-    </w:p>
-    <w:p>
-      <w:pPr>
-        <w:spacing w:after="160" w:line="240" w:lineRule="auto"/>
-      </w:pPr>
-      <w:r>
-        <w:t>No physics background is needed. The six-lesson course is optional: skip the lesson links as you read, and return only if the story sparks your curiosity.</w:t>
-      </w:r>
-    </w:p>
-    <w:p>
-      <w:pPr>
-        <w:pStyle w:val="Heading2"/>
-        <w:spacing w:before="320" w:after="200"/>
-        <w:jc w:val="center"/>
-      </w:pPr>
-      <w:bookmarkStart w:id="2" w:name="authors_note"/>
-      <w:r>
-        <w:rPr>
-          <w:rFonts w:ascii="Amazon Ember" w:eastAsia="Amazon Ember" w:hAnsi="Amazon Ember"/>
-          <w:color w:val="0C447C"/>
-          <w:sz w:val="28"/>
-        </w:rPr>
-        <w:t>Author’s Note</w:t>
-      </w:r>
-      <w:bookmarkEnd w:id="2"/>
-    </w:p>
-    <w:p>
-      <w:pPr>
-        <w:spacing w:after="160" w:line="240" w:lineRule="auto"/>
-      </w:pPr>
-      <w:r>
-        <w:t>As in the first case, the science and historical details identified below are real; the case is fiction. The relativity used here is well tested in the situations described. Closed timelike curves occur in some mathematical solutions of General Relativity, but none have been observed; the self-consistency principle is a proposal, not an established physical law. The case accounts for the morning sheet’s words, route, and arrival; relativity does not send it from its own future. The platform, Sunday slip, and voice remain open questions.</w:t>
-      </w:r>
-    </w:p>
-    <w:p>
-      <w:pPr>
-        <w:spacing w:after="160" w:line="240" w:lineRule="auto"/>
-      </w:pPr>
-      <w:r>
-        <w:t>Real: the speed of light and what it does, and does not do, to the order of events; the slowing of moving clocks, including the 1971 Hafele–Keating flights, whose caesium clocks came home about 59 billionths of a second behind after flying east and about 273 billionths of a second ahead after flying west; the SI second, tied to the caesium-133 hyperfine transition since 1967 and now defined by fixing its unperturbed frequency at exactly 9,192,631,770 Hz; the DCF77 time signal, broadcast from near Frankfurt for Germany’s national metrology institute, the PTB in Braunschweig; and Paddington station and its airport trains. The films named in the course are real films, and every book in the bibliography exists.</w:t>
-      </w:r>
-    </w:p>
-    <w:p>
-      <w:pPr>
-        <w:spacing w:after="160" w:line="240" w:lineRule="auto"/>
-      </w:pPr>
-      <w:r>
-        <w:rPr>
-          <w:rFonts w:ascii="Georgia" w:eastAsia="Georgia" w:hAnsi="Georgia"/>
-        </w:rPr>
-        <w:t>Invented: the Bureau and everyone in it; the building, its landlord, his surveyor and both insurers; form PL/9 and every other form; the school; the morning sheet and Sunday’s lost-property slip; and the impossible platform in the doorway.</w:t>
-      </w:r>
-    </w:p>
-    <w:p>
-      <w:pPr>
-        <w:spacing w:after="160" w:line="240" w:lineRule="auto"/>
-      </w:pPr>
-      <w:r>
-        <w:rPr>
-          <w:rFonts w:ascii="Georgia" w:eastAsia="Georgia" w:hAnsi="Georgia"/>
-        </w:rPr>
-        <w:t>Weinstein’s night train is real. The Sud Expresso (the Sud Express, in French) ran overnight from the French–Spanish border at Hendaye and Irún, across Spain, to Lisbon, and entered Portugal at Vilar Formoso. It was suspended on 17 March 2020 amid the pandemic and border closures. That is why Weinstein speaks of it in the past tense. The border clocks are real too: mainland Portugal moved to Central European Time, Spain’s time, in September 1992, and went back to Western European Time in 1996. A government can move every clock in a country by an hour with a signature. It cannot make one of them tick slower.</w:t>
-      </w:r>
-      <w:r>
-        <w:rPr>
-          <w:rFonts w:ascii="Georgia" w:eastAsia="Georgia" w:hAnsi="Georgia"/>
-        </w:rPr>
-      </w:r>
-    </w:p>
-    <w:p>
-      <w:pPr>
-        <w:spacing w:after="160" w:line="240" w:lineRule="auto"/>
-      </w:pPr>
-      <w:r>
-        <w:rPr>
-          <w:rFonts w:ascii="Georgia" w:eastAsia="Georgia" w:hAnsi="Georgia"/>
-        </w:rPr>
-        <w:t>If you finish the book unsure whether a warning can be early and late at once, congratulations. You are thinking like an investigator. The Bureau files that under Lesson 6.</w:t>
-      </w:r>
-    </w:p>
-    <w:p>
-      <w:pPr>
-        <w:pStyle w:val="Heading1"/>
-        <w:pageBreakBefore/>
-        <w:spacing w:before="320" w:after="200"/>
-        <w:jc w:val="center"/>
-      </w:pPr>
       <w:bookmarkStart w:id="3" w:name="prologue"/>
       <w:r>
         <w:rPr>
@@ -891,7 +834,16 @@
         <w:spacing w:after="160" w:line="240" w:lineRule="auto"/>
       </w:pPr>
       <w:r>
-        <w:t>At the time, the Relativistic Investigation Bureau was closing the file that had occupied it all last week. Case 1047 lay on Derek Gent’s desk for the last time: a fat buff folder; an email received at 9:17 one Tuesday morning, YOU HAVE BEEN MURDERED. THE PERPETRATOR IS YOU; and a photograph of his office doorway with his daughter standing in it, sent by the Bureau’s own case system, CASEBOOK, from an address that called itself LOCALHOST. It had taken a week, four clocks, a professor in Munich and most of Derek’s patience to close the case. CASEBOOK had filled its empty fields with whatever was nearest, and a phone nobody could name had been looking through the Bureau’s camera. The phone was still nobody.</w:t>
+        <w:rPr>
+          <w:rFonts w:ascii="Georgia" w:eastAsia="Georgia" w:hAnsi="Georgia"/>
+        </w:rPr>
+        <w:t>At the time, the Relativistic Investigation Bureau was busy closing a murder that had never happened. Case 1047 lay on Derek Gent’s desk for the last time: a fat buff folder; an email received at 9:17 one Tuesday morning, YOU HAVE BEEN MURDERED. THE PERPETRATOR IS YOU; and a photograph of his office doorway with his daughter standing in it, sent by the Bureau’s own case system, CASEBOOK, from an address that called itself LOCALHOST. It had taken a week, four clocks, a professor in Munich and most of Derek’s</w:t>
+      </w:r>
+      <w:r>
+        <w:rPr>
+          <w:rFonts w:ascii="Georgia" w:eastAsia="Georgia" w:hAnsi="Georgia"/>
+        </w:rPr>
+        <w:t xml:space="preserve"> patience to establish that nobody had been murdered. CASEBOOK had filled its empty fields with whatever was nearest, and a phone nobody could name had been looking through the Bureau’s camera. The phone was still nobody. The email had been wrong about everything except the time.</w:t>
       </w:r>
     </w:p>
     <w:p>
@@ -21150,7 +21102,7 @@
         <w:rPr>
           <w:rFonts w:ascii="Georgia" w:eastAsia="Georgia" w:hAnsi="Georgia"/>
         </w:rPr>
-        <w:t>At half past six on Tuesday Gucci arrived with Tabitha.</w:t>
+        <w:t>At half past six Gucci arrived with Tabitha.</w:t>
       </w:r>
     </w:p>
     <w:p>

</xml_diff>

<commit_message>
Improve Book 2 newcomer on-ramp
</commit_message>
<xml_diff>
--- a/The Relativistic Investigation Bureau - SERIES/Book 2 - The Warning That Was Sent Too Late/The_Warning_That_Was_Sent_Too_Late_BOOK_2_REV05_LINE_EDIT_DRAFT.docx
+++ b/The Relativistic Investigation Bureau - SERIES/Book 2 - The Warning That Was Sent Too Late/The_Warning_That_Was_Sent_Too_Late_BOOK_2_REV05_LINE_EDIT_DRAFT.docx
@@ -126,7 +126,22 @@
             <w:color w:val="0563C1"/>
             <w:u w:val="single"/>
           </w:rPr>
-          <w:t>How to Read This Book (with Author’s Note)</w:t>
+          <w:t>How to Read This Book</w:t>
+        </w:r>
+      </w:hyperlink>
+    </w:p>
+    <w:p>
+      <w:pPr>
+        <w:spacing w:after="40" w:line="240" w:lineRule="auto"/>
+      </w:pPr>
+      <w:hyperlink w:anchor="authors_note">
+        <w:r>
+          <w:rPr>
+            <w:rFonts w:ascii="Georgia" w:hAnsi="Georgia"/>
+            <w:color w:val="0563C1"/>
+            <w:u w:val="single"/>
+          </w:rPr>
+          <w:t>Optional Author’s Note: Real Science and Fiction</w:t>
         </w:r>
       </w:hyperlink>
     </w:p>
@@ -768,78 +783,7 @@
         <w:spacing w:after="160" w:line="240" w:lineRule="auto"/>
       </w:pPr>
       <w:r>
-        <w:t>No physics background is needed. The six-lesson course is optional: skip the lesson links as you read, and return only if the story sparks your curiosity.</w:t>
-      </w:r>
-    </w:p>
-    <w:p>
-      <w:pPr>
-        <w:pStyle w:val="Heading2"/>
-        <w:spacing w:before="320" w:after="200"/>
-        <w:jc w:val="center"/>
-      </w:pPr>
-      <w:bookmarkStart w:id="2" w:name="authors_note"/>
-      <w:r>
-        <w:rPr>
-          <w:rFonts w:ascii="Amazon Ember" w:eastAsia="Amazon Ember" w:hAnsi="Amazon Ember"/>
-          <w:color w:val="0C447C"/>
-          <w:sz w:val="28"/>
-        </w:rPr>
-        <w:t>Author’s Note</w:t>
-      </w:r>
-      <w:bookmarkEnd w:id="2"/>
-    </w:p>
-    <w:p>
-      <w:pPr>
-        <w:spacing w:after="160" w:line="240" w:lineRule="auto"/>
-      </w:pPr>
-      <w:r>
-        <w:t>As in the first case, the science and historical details identified below are real; the case is fiction. The relativity used here is well tested in the situations described. Closed timelike curves occur in some mathematical solutions of General Relativity, but none have been observed; the self-consistency principle is a proposal, not an established physical law. The case accounts for the morning sheet’s words, route, and arrival; relativity does not send it from its own future. The platform, Sunday slip, and voice remain open questions.</w:t>
-      </w:r>
-    </w:p>
-    <w:p>
-      <w:pPr>
-        <w:spacing w:after="160" w:line="240" w:lineRule="auto"/>
-      </w:pPr>
-      <w:r>
-        <w:t>Real: the speed of light and what it does, and does not do, to the order of events; the slowing of moving clocks, including the 1971 Hafele–Keating flights, whose caesium clocks came home about 59 billionths of a second behind after flying east and about 273 billionths of a second ahead after flying west; the SI second, tied to the caesium-133 hyperfine transition since 1967 and now defined by fixing its unperturbed frequency at exactly 9,192,631,770 Hz; the DCF77 time signal, broadcast from near Frankfurt for Germany’s national metrology institute, the PTB in Braunschweig; and Paddington station and its airport trains. The films named in the course are real films, and every book in the bibliography exists.</w:t>
-      </w:r>
-    </w:p>
-    <w:p>
-      <w:pPr>
-        <w:spacing w:after="160" w:line="240" w:lineRule="auto"/>
-      </w:pPr>
-      <w:r>
-        <w:rPr>
-          <w:rFonts w:ascii="Georgia" w:eastAsia="Georgia" w:hAnsi="Georgia"/>
-        </w:rPr>
-        <w:t>Invented: the Bureau and everyone in it; the building, its landlord, his surveyor and both insurers; form PL/9 and every other form; the school; the morning sheet and Sunday’s lost-property slip; and the impossible platform in the doorway.</w:t>
-      </w:r>
-    </w:p>
-    <w:p>
-      <w:pPr>
-        <w:spacing w:after="160" w:line="240" w:lineRule="auto"/>
-      </w:pPr>
-      <w:r>
-        <w:rPr>
-          <w:rFonts w:ascii="Georgia" w:eastAsia="Georgia" w:hAnsi="Georgia"/>
-        </w:rPr>
-        <w:t>Weinstein’s night train is real. The Sud Expresso (the Sud Express, in French) ran overnight from the French–Spanish border at Hendaye and Irún, across Spain, to Lisbon, and entered Portugal at Vilar Formoso. It was suspended on 17 March 2020 amid the pandemic and border closures. That is why Weinstein speaks of it in the past tense. The border clocks are real too: mainland Portugal moved to Central European Time, Spain’s time, in September 1992, and went back to Western European Time in 1996. A government can move every clock in a country by an hour with a signature. It cannot make one of them tick slower.</w:t>
-      </w:r>
-      <w:r>
-        <w:rPr>
-          <w:rFonts w:ascii="Georgia" w:eastAsia="Georgia" w:hAnsi="Georgia"/>
-        </w:rPr>
-      </w:r>
-    </w:p>
-    <w:p>
-      <w:pPr>
-        <w:spacing w:after="160" w:line="240" w:lineRule="auto"/>
-      </w:pPr>
-      <w:r>
-        <w:rPr>
-          <w:rFonts w:ascii="Georgia" w:eastAsia="Georgia" w:hAnsi="Georgia"/>
-        </w:rPr>
-        <w:t>If you finish the book unsure whether a warning can be early and late at once, congratulations. You are thinking like an investigator. The Bureau files that under Lesson 6.</w:t>
+        <w:t>No physics background is needed. The story stands on its own. The optional science note and six brief lessons follow the story if it leaves you curious.</w:t>
       </w:r>
     </w:p>
     <w:p>
@@ -891,7 +835,7 @@
         <w:spacing w:after="160" w:line="240" w:lineRule="auto"/>
       </w:pPr>
       <w:r>
-        <w:t>At the time, the Relativistic Investigation Bureau was closing the file that had occupied it all last week. Case 1047 lay on Derek Gent’s desk for the last time: a fat buff folder; an email received at 9:17 one Tuesday morning, YOU HAVE BEEN MURDERED. THE PERPETRATOR IS YOU; and a photograph of his office doorway with his daughter standing in it, sent by the Bureau’s own case system, CASEBOOK, from an address that called itself LOCALHOST. It had taken a week, four clocks, a professor in Munich and most of Derek’s patience to close the case. CASEBOOK had filled its empty fields with whatever was nearest, and a phone nobody could name had been looking through the Bureau’s camera. The phone was still nobody.</w:t>
+        <w:t>At the time, the Bureau was closing last week’s case. A photograph of Derek’s office doorway had come through its own camera from a phone no one could identify. The account, LOCALHOST, remained open, but it belonged to the old file. It had not sent this warning.</w:t>
       </w:r>
     </w:p>
     <w:p>
@@ -1997,7 +1941,7 @@
         <w:rPr>
           <w:rFonts w:ascii="Georgia" w:eastAsia="Georgia" w:hAnsi="Georgia"/>
         </w:rPr>
-        <w:t>“Last week’s photograph came off our own camera, through our own machine, from a phone nobody has named. Its share was revoked at 01:33 on Sunday morning, in the second of the two one o’clocks, and it is still nobody we can name. Device three is still open, and it can stay open. This did not come from there. Different paper, different route, different lie. I do not want anybody in this room solving last week again because it was comfortable.”</w:t>
+        <w:t>“Last week’s photograph came through our own camera from a phone nobody has named. That account is still open. It is an old question, not this warning’s source. Different paper, different route. I do not want anybody in this room solving last week again because it is more comfortable.”</w:t>
       </w:r>
     </w:p>
     <w:p>
@@ -20871,6 +20815,40 @@
         <w:rPr>
           <w:rFonts w:ascii="Georgia" w:eastAsia="Georgia" w:hAnsi="Georgia"/>
         </w:rPr>
+        <w:t>“So the paper has a printer and a route. The sentence has no first author.”</w:t>
+      </w:r>
+      <w:r>
+        <w:rPr>
+          <w:rFonts w:ascii="Georgia" w:eastAsia="Georgia" w:hAnsi="Georgia"/>
+        </w:rPr>
+        <w:t/>
+      </w:r>
+    </w:p>
+    <w:p>
+      <w:pPr>
+        <w:spacing w:after="160" w:line="240" w:lineRule="auto"/>
+      </w:pPr>
+      <w:r>
+        <w:rPr>
+          <w:rFonts w:ascii="Georgia" w:eastAsia="Georgia" w:hAnsi="Georgia"/>
+        </w:rPr>
+        <w:t>“Exactly. The paper has a history. The sentence has a closed one.”</w:t>
+      </w:r>
+      <w:r>
+        <w:rPr>
+          <w:rFonts w:ascii="Georgia" w:eastAsia="Georgia" w:hAnsi="Georgia"/>
+        </w:rPr>
+        <w:t/>
+      </w:r>
+    </w:p>
+    <w:p>
+      <w:pPr>
+        <w:spacing w:after="160" w:line="240" w:lineRule="auto"/>
+      </w:pPr>
+      <w:r>
+        <w:rPr>
+          <w:rFonts w:ascii="Georgia" w:eastAsia="Georgia" w:hAnsi="Georgia"/>
+        </w:rPr>
         <w:t>“And the train itself?”</w:t>
       </w:r>
     </w:p>
@@ -22109,6 +22087,77 @@
           <w:rFonts w:ascii="Georgia" w:eastAsia="Georgia" w:hAnsi="Georgia"/>
         </w:rPr>
         <w:t>SUNDAY SLIP (PADDINGTON LOST PROPERTY). CASE STATUS: RING LOGGED. SENDER STILL UNKNOWN.</w:t>
+      </w:r>
+    </w:p>
+    <w:p>
+      <w:pPr>
+        <w:pStyle w:val="Heading1"/>
+        <w:spacing w:before="320" w:after="200"/>
+        <w:jc w:val="center"/>
+      </w:pPr>
+      <w:bookmarkStart w:id="2" w:name="authors_note"/>
+      <w:r>
+        <w:rPr>
+          <w:rFonts w:ascii="Amazon Ember" w:eastAsia="Amazon Ember" w:hAnsi="Amazon Ember"/>
+          <w:color w:val="0C447C"/>
+          <w:sz w:val="28"/>
+        </w:rPr>
+        <w:t>Optional Author’s Note: Real Science and Fiction</w:t>
+      </w:r>
+      <w:bookmarkEnd w:id="2"/>
+    </w:p>
+    <w:p>
+      <w:pPr>
+        <w:spacing w:after="160" w:line="240" w:lineRule="auto"/>
+      </w:pPr>
+      <w:r>
+        <w:t>The science and historical details identified here are real; the case is fiction. The relativity used here is well tested in the situations described. Closed timelike curves occur in some mathematical solutions of General Relativity, but none have been observed; the self-consistency principle is a proposal, not an established physical law. The case accounts for the morning sheet’s words, route, and arrival; relativity does not send it from its own future. The platform, Sunday slip, and voice remain open questions.</w:t>
+      </w:r>
+    </w:p>
+    <w:p>
+      <w:pPr>
+        <w:spacing w:after="160" w:line="240" w:lineRule="auto"/>
+      </w:pPr>
+      <w:r>
+        <w:t>Real: the speed of light and what it does, and does not do, to the order of events; the slowing of moving clocks, including the 1971 Hafele–Keating flights, whose caesium clocks came home about 59 billionths of a second behind after flying east and about 273 billionths of a second ahead after flying west; the SI second, tied to the caesium-133 hyperfine transition since 1967 and now defined by fixing its unperturbed frequency at exactly 9,192,631,770 Hz; the DCF77 time signal, broadcast from near Frankfurt for Germany’s national metrology institute, the PTB in Braunschweig; and Paddington station and its airport trains. The films named in the course are real films, and every book in the bibliography exists.</w:t>
+      </w:r>
+    </w:p>
+    <w:p>
+      <w:pPr>
+        <w:spacing w:after="160" w:line="240" w:lineRule="auto"/>
+      </w:pPr>
+      <w:r>
+        <w:rPr>
+          <w:rFonts w:ascii="Georgia" w:eastAsia="Georgia" w:hAnsi="Georgia"/>
+        </w:rPr>
+        <w:t>Invented: the Bureau and everyone in it; the building, its landlord, his surveyor and both insurers; form PL/9 and every other form; the school; the morning sheet and Sunday’s lost-property slip; and the impossible platform in the doorway.</w:t>
+      </w:r>
+    </w:p>
+    <w:p>
+      <w:pPr>
+        <w:spacing w:after="160" w:line="240" w:lineRule="auto"/>
+      </w:pPr>
+      <w:r>
+        <w:rPr>
+          <w:rFonts w:ascii="Georgia" w:eastAsia="Georgia" w:hAnsi="Georgia"/>
+        </w:rPr>
+        <w:t>Weinstein’s night train is real. The Sud Expresso (the Sud Express, in French) ran overnight from the French–Spanish border at Hendaye and Irún, across Spain, to Lisbon, and entered Portugal at Vilar Formoso. It was suspended on 17 March 2020 amid the pandemic and border closures. That is why Weinstein speaks of it in the past tense. The border clocks are real too: mainland Portugal moved to Central European Time, Spain’s time, in September 1992, and went back to Western European Time in 1996. A government can move every clock in a country by an hour with a signature. It cannot make one of them tick slower.</w:t>
+      </w:r>
+      <w:r>
+        <w:rPr>
+          <w:rFonts w:ascii="Georgia" w:eastAsia="Georgia" w:hAnsi="Georgia"/>
+        </w:rPr>
+      </w:r>
+    </w:p>
+    <w:p>
+      <w:pPr>
+        <w:spacing w:after="160" w:line="240" w:lineRule="auto"/>
+      </w:pPr>
+      <w:r>
+        <w:rPr>
+          <w:rFonts w:ascii="Georgia" w:eastAsia="Georgia" w:hAnsi="Georgia"/>
+        </w:rPr>
+        <w:t>If you finish the book unsure whether a warning can be early and late at once, congratulations. You are thinking like an investigator. The Bureau files that under Lesson 6.</w:t>
       </w:r>
     </w:p>
     <w:p>

</xml_diff>

<commit_message>
Clarify Book 2 entry and optional science note
</commit_message>
<xml_diff>
--- a/The Relativistic Investigation Bureau - SERIES/Book 2 - The Warning That Was Sent Too Late/The_Warning_That_Was_Sent_Too_Late_BOOK_2_REV05_LINE_EDIT_DRAFT.docx
+++ b/The Relativistic Investigation Bureau - SERIES/Book 2 - The Warning That Was Sent Too Late/The_Warning_That_Was_Sent_Too_Late_BOOK_2_REV05_LINE_EDIT_DRAFT.docx
@@ -113,7 +113,7 @@
             <w:color w:val="0563C1"/>
             <w:u w:val="single"/>
           </w:rPr>
-          <w:t>How to Read This Book (with Author’s Note)</w:t>
+          <w:t>How to Read This Book</w:t>
         </w:r>
       </w:hyperlink>
     </w:p>
@@ -496,6 +496,21 @@
       <w:pPr>
         <w:spacing w:after="40" w:line="240" w:lineRule="auto"/>
       </w:pPr>
+      <w:hyperlink w:anchor="authors_note">
+        <w:r>
+          <w:rPr>
+            <w:rFonts w:ascii="Georgia" w:hAnsi="Georgia"/>
+            <w:color w:val="0563C1"/>
+            <w:u w:val="single"/>
+          </w:rPr>
+          <w:t>Optional Author’s Note: Real Science and Fiction</w:t>
+        </w:r>
+      </w:hyperlink>
+    </w:p>
+    <w:p>
+      <w:pPr>
+        <w:spacing w:after="40" w:line="240" w:lineRule="auto"/>
+      </w:pPr>
       <w:hyperlink w:anchor="course">
         <w:r>
           <w:rPr>
@@ -716,77 +731,6 @@
     </w:p>
     <w:p>
       <w:pPr>
-        <w:pStyle w:val="Heading2"/>
-        <w:spacing w:before="320" w:after="200"/>
-        <w:jc w:val="center"/>
-      </w:pPr>
-      <w:bookmarkStart w:id="2" w:name="authors_note"/>
-      <w:r>
-        <w:rPr>
-          <w:rFonts w:ascii="Amazon Ember" w:eastAsia="Amazon Ember" w:hAnsi="Amazon Ember"/>
-          <w:color w:val="0C447C"/>
-          <w:sz w:val="28"/>
-        </w:rPr>
-        <w:t>Author’s Note</w:t>
-      </w:r>
-      <w:bookmarkEnd w:id="2"/>
-    </w:p>
-    <w:p>
-      <w:pPr>
-        <w:spacing w:after="160" w:line="240" w:lineRule="auto"/>
-      </w:pPr>
-      <w:r>
-        <w:t>As in the first case, the science and historical details identified below are real; the case is fiction. The relativity used here is well tested in the situations described. Closed timelike curves occur in some mathematical solutions of General Relativity, but none have been observed; the self-consistency principle is a proposal, not an established physical law. The case accounts for the morning sheet’s words, route, and arrival; relativity does not send it from its own future. The platform, Sunday slip, and voice remain open questions.</w:t>
-      </w:r>
-    </w:p>
-    <w:p>
-      <w:pPr>
-        <w:spacing w:after="160" w:line="240" w:lineRule="auto"/>
-      </w:pPr>
-      <w:r>
-        <w:t>Real: the speed of light and what it does, and does not do, to the order of events; the slowing of moving clocks, including the 1971 Hafele–Keating flights, whose caesium clocks came home about 59 billionths of a second behind after flying east and about 273 billionths of a second ahead after flying west; the SI second, tied to the caesium-133 hyperfine transition since 1967 and now defined by fixing its unperturbed frequency at exactly 9,192,631,770 Hz; the DCF77 time signal, broadcast from near Frankfurt for Germany’s national metrology institute, the PTB in Braunschweig; and Paddington station and its airport trains. The films named in the course are real films, and every book in the bibliography exists.</w:t>
-      </w:r>
-    </w:p>
-    <w:p>
-      <w:pPr>
-        <w:spacing w:after="160" w:line="240" w:lineRule="auto"/>
-      </w:pPr>
-      <w:r>
-        <w:rPr>
-          <w:rFonts w:ascii="Georgia" w:eastAsia="Georgia" w:hAnsi="Georgia"/>
-        </w:rPr>
-        <w:t>Invented: the Bureau and everyone in it; the building, its landlord, his surveyor and both insurers; form PL/9 and every other form; the school; the morning sheet and Sunday’s lost-property slip; and the impossible platform in the doorway.</w:t>
-      </w:r>
-    </w:p>
-    <w:p>
-      <w:pPr>
-        <w:spacing w:after="160" w:line="240" w:lineRule="auto"/>
-      </w:pPr>
-      <w:r>
-        <w:rPr>
-          <w:rFonts w:ascii="Georgia" w:eastAsia="Georgia" w:hAnsi="Georgia"/>
-        </w:rPr>
-        <w:t>Weinstein’s night train is real. The Sud Expresso (the Sud Express, in French) ran overnight from the French–Spanish border at Hendaye and Irún, across Spain, to Lisbon, and entered Portugal at Vilar Formoso. It was suspended on 17 March 2020 amid the pandemic and border closures. That is why Weinstein speaks of it in the past tense. The border clocks are real too: mainland Portugal moved to Central European Time, Spain’s time, in September 1992, and went back to Western European Time in 1996. A government can move every clock in a country by an hour with a signature. It cannot make one of them tick slower.</w:t>
-      </w:r>
-      <w:r>
-        <w:rPr>
-          <w:rFonts w:ascii="Georgia" w:eastAsia="Georgia" w:hAnsi="Georgia"/>
-        </w:rPr>
-      </w:r>
-    </w:p>
-    <w:p>
-      <w:pPr>
-        <w:spacing w:after="160" w:line="240" w:lineRule="auto"/>
-      </w:pPr>
-      <w:r>
-        <w:rPr>
-          <w:rFonts w:ascii="Georgia" w:eastAsia="Georgia" w:hAnsi="Georgia"/>
-        </w:rPr>
-        <w:t>If you finish the book unsure whether a warning can be early and late at once, congratulations. You are thinking like an investigator. The Bureau files that under Lesson 6.</w:t>
-      </w:r>
-    </w:p>
-    <w:p>
-      <w:pPr>
         <w:pStyle w:val="Heading1"/>
         <w:pageBreakBefore/>
         <w:spacing w:before="320" w:after="200"/>
@@ -20823,6 +20767,28 @@
         <w:rPr>
           <w:rFonts w:ascii="Georgia" w:eastAsia="Georgia" w:hAnsi="Georgia"/>
         </w:rPr>
+        <w:t>“So the paper has a printer and a route. The sentence has no first author.”</w:t>
+      </w:r>
+    </w:p>
+    <w:p>
+      <w:pPr>
+        <w:spacing w:after="160" w:line="240" w:lineRule="auto"/>
+      </w:pPr>
+      <w:r>
+        <w:rPr>
+          <w:rFonts w:ascii="Georgia" w:eastAsia="Georgia" w:hAnsi="Georgia"/>
+        </w:rPr>
+        <w:t>“Exactly. The paper has a history. The sentence has a closed one.”</w:t>
+      </w:r>
+    </w:p>
+    <w:p>
+      <w:pPr>
+        <w:spacing w:after="160" w:line="240" w:lineRule="auto"/>
+      </w:pPr>
+      <w:r>
+        <w:rPr>
+          <w:rFonts w:ascii="Georgia" w:eastAsia="Georgia" w:hAnsi="Georgia"/>
+        </w:rPr>
         <w:t>“And the train itself?”</w:t>
       </w:r>
     </w:p>
@@ -22061,6 +22027,77 @@
           <w:rFonts w:ascii="Georgia" w:eastAsia="Georgia" w:hAnsi="Georgia"/>
         </w:rPr>
         <w:t>SUNDAY SLIP (PADDINGTON LOST PROPERTY). CASE STATUS: RING LOGGED. SENDER STILL UNKNOWN.</w:t>
+      </w:r>
+    </w:p>
+    <w:p>
+      <w:pPr>
+        <w:pStyle w:val="Heading1"/>
+        <w:spacing w:before="320" w:after="200"/>
+        <w:jc w:val="center"/>
+      </w:pPr>
+      <w:bookmarkStart w:id="2" w:name="authors_note"/>
+      <w:r>
+        <w:rPr>
+          <w:rFonts w:ascii="Amazon Ember" w:eastAsia="Amazon Ember" w:hAnsi="Amazon Ember"/>
+          <w:color w:val="0C447C"/>
+          <w:sz w:val="28"/>
+        </w:rPr>
+        <w:t>Optional Author’s Note: Real Science and Fiction</w:t>
+      </w:r>
+      <w:bookmarkEnd w:id="2"/>
+    </w:p>
+    <w:p>
+      <w:pPr>
+        <w:spacing w:after="160" w:line="240" w:lineRule="auto"/>
+      </w:pPr>
+      <w:r>
+        <w:t>As in the first case, the science and historical details identified below are real; the case is fiction. The relativity used here is well tested in the situations described. Closed timelike curves occur in some mathematical solutions of General Relativity, but none have been observed; the self-consistency principle is a proposal, not an established physical law. The case accounts for the morning sheet’s words, route, and arrival; relativity does not send it from its own future. The platform, Sunday slip, and voice remain open questions.</w:t>
+      </w:r>
+    </w:p>
+    <w:p>
+      <w:pPr>
+        <w:spacing w:after="160" w:line="240" w:lineRule="auto"/>
+      </w:pPr>
+      <w:r>
+        <w:t>Real: the speed of light and what it does, and does not do, to the order of events; the slowing of moving clocks, including the 1971 Hafele–Keating flights, whose caesium clocks came home about 59 billionths of a second behind after flying east and about 273 billionths of a second ahead after flying west; the SI second, tied to the caesium-133 hyperfine transition since 1967 and now defined by fixing its unperturbed frequency at exactly 9,192,631,770 Hz; the DCF77 time signal, broadcast from near Frankfurt for Germany’s national metrology institute, the PTB in Braunschweig; and Paddington station and its airport trains. The films named in the course are real films, and every book in the bibliography exists.</w:t>
+      </w:r>
+    </w:p>
+    <w:p>
+      <w:pPr>
+        <w:spacing w:after="160" w:line="240" w:lineRule="auto"/>
+      </w:pPr>
+      <w:r>
+        <w:rPr>
+          <w:rFonts w:ascii="Georgia" w:eastAsia="Georgia" w:hAnsi="Georgia"/>
+        </w:rPr>
+        <w:t>Invented: the Bureau and everyone in it; the building, its landlord, his surveyor and both insurers; form PL/9 and every other form; the school; the morning sheet and Sunday’s lost-property slip; and the impossible platform in the doorway.</w:t>
+      </w:r>
+    </w:p>
+    <w:p>
+      <w:pPr>
+        <w:spacing w:after="160" w:line="240" w:lineRule="auto"/>
+      </w:pPr>
+      <w:r>
+        <w:rPr>
+          <w:rFonts w:ascii="Georgia" w:eastAsia="Georgia" w:hAnsi="Georgia"/>
+        </w:rPr>
+        <w:t>Weinstein’s night train is real. The Sud Expresso (the Sud Express, in French) ran overnight from the French–Spanish border at Hendaye and Irún, across Spain, to Lisbon, and entered Portugal at Vilar Formoso. It was suspended on 17 March 2020 amid the pandemic and border closures. That is why Weinstein speaks of it in the past tense. The border clocks are real too: mainland Portugal moved to Central European Time, Spain’s time, in September 1992, and went back to Western European Time in 1996. A government can move every clock in a country by an hour with a signature. It cannot make one of them tick slower.</w:t>
+      </w:r>
+      <w:r>
+        <w:rPr>
+          <w:rFonts w:ascii="Georgia" w:eastAsia="Georgia" w:hAnsi="Georgia"/>
+        </w:rPr>
+      </w:r>
+    </w:p>
+    <w:p>
+      <w:pPr>
+        <w:spacing w:after="160" w:line="240" w:lineRule="auto"/>
+      </w:pPr>
+      <w:r>
+        <w:rPr>
+          <w:rFonts w:ascii="Georgia" w:eastAsia="Georgia" w:hAnsi="Georgia"/>
+        </w:rPr>
+        <w:t>If you finish the book unsure whether a warning can be early and late at once, congratulations. You are thinking like an investigator. The Bureau files that under Lesson 6.</w:t>
       </w:r>
     </w:p>
     <w:p>

</xml_diff>